<commit_message>
Describe battle tactics as the plan for the round.
Each round the player chooses Fight, Run, or Tactics. Fight uses the tactic already picked. The old text said that choice did nothing.
</commit_message>
<xml_diff>
--- a/dragon-warrior-iv-rom-hack-notes.docx
+++ b/dragon-warrior-iv-rom-hack-notes.docx
@@ -125,7 +125,7 @@
         <w:spacing w:before="0" w:after="140"/>
       </w:pPr>
       <w:r>
-        <w:t xml:space="preserve">The battle Tactics command is on the menu from Chapter 1. Choosing a tactic does not yet stop the fight-command prompt for the character you control. That part is unfinished.</w:t>
+        <w:t>The battle Tactics command is on the menu from Chapter 1. Each round you choose Fight, Run, or a new tactic. After that choice, the party fights from the tactic you picked.</w:t>
       </w:r>
     </w:p>
     <w:p>
@@ -350,7 +350,7 @@
         <w:spacing w:before="0" w:after="140"/>
       </w:pPr>
       <w:r>
-        <w:t xml:space="preserve">Nothing in the Tactics menu stores $6178. The fight prompt is chosen earlier, at the battle command path, before this hook. After the menu was confirmed in play, the controlled character still had to enter every fight command. Do not describe ally automation as finished, and do not turn the feature on with a hidden button. A fix has to skip the prompt in the command path. Setting $6178 inside the AI hook alone does not do that.</w:t>
+        <w:t>Nothing in the Tactics menu stores $6178. That byte was only a separate idea for forcing the controlled character onto the ally path, and the menu does not write it. The round itself uses the Chapter 5 battle menu. Each round the player chooses Fight, Run, or Tactics. Fight then plays the round from the tactic already picked. Tactics changes that plan.</w:t>
       </w:r>
     </w:p>
     <w:p>
@@ -1518,7 +1518,7 @@
         <w:spacing w:before="0" w:after="60"/>
       </w:pPr>
       <w:r>
-        <w:t xml:space="preserve">The Tactics line shows up from early in the game. Fight commands are still required. Confirmed in play.</w:t>
+        <w:t>The Tactics line shows up from early in the game. Each round the choice is Fight, Run, or Tactics, and the round then follows the tactic that was picked.</w:t>
       </w:r>
     </w:p>
     <w:p>

</xml_diff>

<commit_message>
Publish the current Smart Context patch and describe each feature.
The BPS now targets CRC32 7AA6D320 and applies in Floating IPS. The README, the website, and the install notes each give page clear, Smart A, the Select menu, Set AI, and tactics their own section.
</commit_message>
<xml_diff>
--- a/dragon-warrior-iv-rom-hack-notes.docx
+++ b/dragon-warrior-iv-rom-hack-notes.docx
@@ -40,7 +40,7 @@
         <w:spacing w:before="0" w:after="140"/>
       </w:pPr>
       <w:r>
-        <w:t>Every change is in that ROM. There is no Lua script and no Game Genie code. The original ROM file was not modified. 296 bytes differ from the original. The file is still 524,304 bytes, and the iNES header is unchanged.</w:t>
+        <w:t>Every change is in that ROM. There is no Lua script and no Game Genie code. The original ROM file was not modified. 469 bytes differ from the original. The published BPS is dragon-warrior-iv-usa-smart-context.bps. It is 612 bytes. Its target CRC32 is 7AA6D320. It includes page clear, Door then Talk then Search, the Select menu, and Set AI. The ROM is still 524,304 bytes, and the iNES header is unchanged.</w:t>
       </w:r>
     </w:p>
     <w:p>
@@ -69,47 +69,47 @@
         <w:spacing w:before="0" w:after="60"/>
       </w:pPr>
       <w:r>
-        <w:t xml:space="preserve">Talk. It looks one tile ahead first. If that tile is empty, it looks two tiles ahead, which is how shop counters are set up. The closer person wins.</w:t>
-      </w:r>
-    </w:p>
-    <w:p>
-      <w:pPr>
-        <w:numPr>
-          <w:ilvl w:val="0"/>
-          <w:numId w:val="1"/>
-        </w:numPr>
-        <w:spacing w:before="0" w:after="60"/>
-      </w:pPr>
-      <w:r>
-        <w:t>Door, if nobody was there. Door runs only when the tile one step ahead is a door tile the game already recognizes. The real Door command then runs, including a locked door and its own message. After that command runs, the game waits until you release A. Search does not run on that same press.</w:t>
-      </w:r>
-    </w:p>
-    <w:p>
-      <w:pPr>
-        <w:numPr>
-          <w:ilvl w:val="0"/>
-          <w:numId w:val="1"/>
-        </w:numPr>
-        <w:spacing w:before="0" w:after="60"/>
-      </w:pPr>
-      <w:r>
-        <w:t xml:space="preserve">Search, if it was not a door tile. Search may still say that nothing was found. That line in the log is expected.</w:t>
-      </w:r>
-    </w:p>
-    <w:p>
-      <w:pPr>
-        <w:spacing w:before="0" w:after="140"/>
-      </w:pPr>
-      <w:r>
-        <w:t xml:space="preserve">Select opens the old Command menu: Talk, Spell, Status, Item, Equip, Tactics, Door, and Search. After you choose or cancel, release Select so the menu does not open again.</w:t>
-      </w:r>
-    </w:p>
-    <w:p>
-      <w:pPr>
-        <w:spacing w:before="0" w:after="140"/>
-      </w:pPr>
-      <w:r>
-        <w:t xml:space="preserve">The menu Talk command also looks two tiles ahead, and the closer person still wins. It can reach a person through a one-tile wall. If both tiles are empty it still says nobody is there, and it still does the original object-in-front check. Smart A skips that object check and goes on to Door or Search.</w:t>
+        <w:t>Door, if the tile one step ahead is a real door. The Door command runs, including a locked door and its message. The game waits until you release A, so Talk and Search do not run on that press. A shop counter still goes to Talk, so the shopkeeper two tiles away is the one who answers.</w:t>
+      </w:r>
+    </w:p>
+    <w:p>
+      <w:pPr>
+        <w:numPr>
+          <w:ilvl w:val="0"/>
+          <w:numId w:val="1"/>
+        </w:numPr>
+        <w:spacing w:before="0" w:after="60"/>
+      </w:pPr>
+      <w:r>
+        <w:t>Talk, if that tile was not a door. It looks one tile ahead first. If that tile is empty, it looks two tiles ahead, which is how shop counters are set up. The closer person wins.</w:t>
+      </w:r>
+    </w:p>
+    <w:p>
+      <w:pPr>
+        <w:numPr>
+          <w:ilvl w:val="0"/>
+          <w:numId w:val="1"/>
+        </w:numPr>
+        <w:spacing w:before="0" w:after="60"/>
+      </w:pPr>
+      <w:r>
+        <w:t>Search, if it was not a door and nobody was there. Search may still say that nothing was found. That line in the log is expected.</w:t>
+      </w:r>
+    </w:p>
+    <w:p>
+      <w:pPr>
+        <w:spacing w:before="0" w:after="140"/>
+      </w:pPr>
+      <w:r>
+        <w:t>Select opens the old Command menu: Talk, Spell, Status, Item, Equip, Tactics, Door, and Set AI. After you choose or cancel, release Select so the menu does not open again.</w:t>
+      </w:r>
+    </w:p>
+    <w:p>
+      <w:pPr>
+        <w:spacing w:before="0" w:after="140"/>
+      </w:pPr>
+      <w:r>
+        <w:t>The menu Talk command also looks two tiles ahead, and the closer person still wins. It can reach a person through a one-tile wall. If both tiles are empty it still says nobody is there, and it still does the original object-in-front check. Smart A skips that object check. It tries Door, then Talk, then Search.</w:t>
       </w:r>
     </w:p>
     <w:p>
@@ -146,7 +146,7 @@
         <w:spacing w:before="0" w:after="60"/>
       </w:pPr>
       <w:r>
-        <w:t>Leave Dragon Warrior IV (USA).nes as it shipped. Apply the BPS to a copy and save that copy under a new name. The unmodified USA ROM is 524,304 bytes and its CRC32 is F6B24806. The patched ROM CRC32 is D22F542B. The BPS file CRC32 is 57AF999D.</w:t>
+        <w:t>Leave Dragon Warrior IV (USA).nes as it shipped. Apply the BPS to a copy and save that copy under a new name. The unmodified USA ROM is 524,304 bytes and its CRC32 is F6B24806. The patched ROM CRC32 is 7AA6D320. The BPS file is 612 bytes. Its CRC32 is F9FC774E, which is the checksum of every byte except the final four. Those four bytes store the same value. Use Floating IPS. Release v1.0.0 is an older file, and Floating IPS rejects it.</w:t>
       </w:r>
     </w:p>
     <w:p>
@@ -244,15 +244,15 @@
         <w:spacing w:before="0" w:after="140"/>
       </w:pPr>
       <w:r>
-        <w:t xml:space="preserve">Two places call it. The continue-mark confirm at $81C1 used to jump to $83D2. It now calls $85AD. When the row counter at $0552 reaches 8, $83EC calls $85AD and returns. $83F0 through $83F9 are NOPs. The return at $83FA stays put. The redraw path at $83FB calls $8652 instead of $85AD, so a clear does not call itself.</w:t>
-      </w:r>
-    </w:p>
-    <w:p>
-      <w:pPr>
-        <w:spacing w:before="0" w:after="140"/>
-      </w:pPr>
-      <w:r>
-        <w:t xml:space="preserve">A later experiment cleared the log when a menu returned. Continue and a new quest both return from a menu, so the first line of dialogue always took that path, and the clear ran before the window size was set. The game froze. The file-select screen had also crashed while that experiment used a jump into the middle of another routine. The whole experiment was removed. $8028 is still JSR $872B. $8A6F and $8AA1 are still LDA $F8 / RTS. Do not call $85AD from $8028, and do not set a pending clear when a menu returns.</w:t>
+        <w:t>Two places call it. The continue-mark confirm at $81C1 used to jump to $83D2. It now calls $85AD. When the row counter at $0552 reaches 8, $83EC calls $85AD and returns. $83F0 through $83F9 jump to the normal text seek unless $51 is $17. The return at $83FA stays put. The redraw path at $83FB calls $8652 instead of $85AD, so a clear does not call itself.</w:t>
+      </w:r>
+    </w:p>
+    <w:p>
+      <w:pPr>
+        <w:spacing w:before="0" w:after="140"/>
+      </w:pPr>
+      <w:r>
+        <w:t>A later experiment cleared the log when a menu returned. Continue and a new quest both return from a menu, so the first line of dialogue always took that path, and the clear ran before the window size was set. The game froze. The file-select screen had also crashed while that experiment used a jump into the middle of another routine. The whole experiment was removed. $8028 calls $83F0, and $83F0 jumps to $872B unless $51 is $17. $8A6F and $8AA1 are still LDA $F8 / RTS. Do not call $85AD from $8028, and do not set a pending clear when a menu returns.</w:t>
       </w:r>
     </w:p>
     <w:p>
@@ -293,15 +293,15 @@
         <w:spacing w:before="0" w:after="140"/>
       </w:pPr>
       <w:r>
-        <w:t>Smart A itself is bank $1E $80CE. The field stub at $CC53 calls that address. It stores $80 in $0539 so the delayed command popup stays quiet until a window close clears it. The shared search is $80E6. If sprite layer $41 bit 7 is clear, it branches to $8142 and returns with carry clear, which skips the person search. Otherwise it looks one tile ahead ($81AE, then the sprite scan $8126) and, only on a miss, steps once more ($81B8) and scans again. A hit leaves the sprite index in X and jumps to the original talk code at $80F9, which was not moved. The shared search ends in JMP $8126. On a hit of the near tile it jumps there without the extra step, so the second scan is the same tile. $8126 only compares coordinates, starting at sprite 6, and returns carry set with X equal to the sprite.</w:t>
-      </w:r>
-    </w:p>
-    <w:p>
-      <w:pPr>
-        <w:spacing w:before="0" w:after="140"/>
-      </w:pPr>
-      <w:r>
-        <w:t>If nobody is there, $B35D reads the tile one step ahead. Carry is set when that tile's behavior is $14 through $23. That is the same range the Door command uses. Carry clear jumps to Search at $B3F3. Carry set calls the real Door command at $B2A6. When that command returns, the code jumps to $FF86. $FF86 reads the pad once per frame until A is released, then returns to the bank-switch stub. Search is not reached on that press. A door that finished while A was still held used to be followed by Search on the next poll. The wait stops that. Search still returns through its own exit to the same stub. Behavior $17 is inside the door range, and the old Talk command also treated $17 and $27 as counter tiles worth a second look. Talk still runs first, so a shopkeeper two tiles away is reached before Door. An empty $17 tile can run Door instead of Search.</w:t>
+        <w:t>Smart A itself is bank $1E $80CE. The field stub at $CC53 calls that address. It stores $80 in $0539 so the delayed command popup stays quiet until a window close clears it. The shared search is $80E7. If sprite layer $41 bit 7 is clear, it branches to $8142 and returns with carry clear, which skips the person search. Otherwise it looks one tile ahead ($81AE, then the sprite scan $8126) and, only on a miss, steps once more ($81B8) and scans again. A hit leaves the sprite index in X and jumps to the original talk code at $80F9, which was not moved. The shared search ends in JMP $8126. On a hit of the near tile it jumps there without the extra step, so the second scan is the same tile. $8126 only compares coordinates, starting at sprite 6, and returns carry set with X equal to the sprite.</w:t>
+      </w:r>
+    </w:p>
+    <w:p>
+      <w:pPr>
+        <w:spacing w:before="0" w:after="140"/>
+      </w:pPr>
+      <w:r>
+        <w:t>Smart A calls $B35D before Talk. Carry is set when the tile one step ahead has behavior $14 through $23, the same range the Door command uses. Behavior $17 is also in that range, and it is the shop-counter tile, so $17 is sent to Talk instead of Door. Any other door jumps to $FF83. $FF83 calls the real Door command at $B2A6, then falls into $FF86. $FF86 reads the pad once per frame until A is released, then returns to the bank-switch stub. Talk and Search do not run on that press. If Door does not run, the shared search runs. A hit continues at $80F9. A miss jumps to Search at $B3F3. Behavior $27 is outside the door range, so it already falls through to Talk.</w:t>
       </w:r>
     </w:p>
     <w:p>
@@ -342,15 +342,15 @@
         <w:spacing w:before="0" w:after="140"/>
       </w:pPr>
       <w:r>
-        <w:t xml:space="preserve">Bank $11 $88CA calls $BFB1 and then the original AI break. $BFB1 reads SRAM $6178. Only the value $01 continues. It then sets bit $10 of $72F4,X for the actor index in $96. The battle AI already skips a character whose $72F4 mask is not exactly that pattern. The controlled character is not party slot 0. In the Chapter 1 opening, slot 0 is Ragnar, character id $06. The hero's character id is $00.</w:t>
-      </w:r>
-    </w:p>
-    <w:p>
-      <w:pPr>
-        <w:spacing w:before="0" w:after="140"/>
-      </w:pPr>
-      <w:r>
-        <w:t>Nothing in the Tactics menu stores $6178. That byte was only a separate idea for forcing the controlled character onto the ally path, and the menu does not write it. The round itself uses the Chapter 5 battle menu. Each round the player chooses Fight, Run, or Tactics. Fight then plays the round from the tactic already picked. Tactics changes that plan.</w:t>
+        <w:t>Bank $11 $88CA runs the original AI break and does not call $BFB1. $8241 calls $BFB1 instead of the stock finder $870C. That finder returns the hero, character id $00, and does not return a chapter lead such as Ragnar. When $6178 is $01, $BFB1 skips the fight prompt and stores $FF in $7358. When $6178 is any other value and the finder returns nobody, party slot 0 gets the prompt. In the Chapter 1 opening, that slot is Ragnar, character id $06. The hero's character id is $00, and the stock finder still returns him in Chapter 5.</w:t>
+      </w:r>
+    </w:p>
+    <w:p>
+      <w:pPr>
+        <w:spacing w:before="0" w:after="140"/>
+      </w:pPr>
+      <w:r>
+        <w:t>The field menu line that used to say Search now says Set AI. Smart A still searches, so the menu does not need its own Search command. Set AI opens the existing yes/no menu, script $48. Yes stores $01 in SRAM $6178 and the log says Player AI On. No stores $00 and the log says Player AI Off. Cancel changes nothing. A new game, and any value other than $01, stays on manual commands, the same fight prompt as stock Dragon Quest IV. Set the flag on the field before a battle. It stays for that fight. The battle Tactics menu still changes the plan and does not write $6178. The other party members keep using tactics either way. When $6178 is $01, $BFB1 skips the fight prompt and the existing battle AI takes the turn. When it is not $01, the hero keeps the stock prompt, and a chapter lead is prompted from party slot 0. $8219 is the original compare again. Set AI was confirmed in play. On leaves the controlled character to the tactic. Off gives that character the normal command menu. The two log lines are Huffman text in bank $17. Bank $16 $8028 calls $83F0 first, and that hook skips the normal text seek only when $51 is $17. $51 is cleared after the line. The old Search jump at bank $1E $8340 is now JMP $FF70. Both fixed banks hold BRK index $03, argument $78, then RTS, which enters bank $17 at $BEE4. Smart A still jumps to the old Search body at $B3F3. Each round the player still chooses Fight, Run, or Tactics. Fight plays the round from the tactic already picked. Tactics changes that plan.</w:t>
       </w:r>
     </w:p>
     <w:p>
@@ -534,7 +534,7 @@
                 <w:sz w:val="20"/>
                 <w:szCs w:val="20"/>
               </w:rPr>
-              <w:t xml:space="preserve">A full window calls $85AD and returns. $83F0–$83F9 are NOPs. The return at $83FA stays.</w:t>
+              <w:t>A full window calls $85AD and returns. $83F0–$83F9 skip the text seek when $51 is $17. The return at $83FA stays.</w:t>
             </w:r>
           </w:p>
         </w:tc>
@@ -684,7 +684,7 @@
                 <w:sz w:val="20"/>
                 <w:szCs w:val="20"/>
               </w:rPr>
-              <w:t xml:space="preserve">Original bytes. The clear-after-a-menu experiment was removed after it froze the first line of dialogue.</w:t>
+              <w:t>$8A6F and $8AA1 are still the original LDA $F8 / RTS. $8028 is JSR $83F0. The clear-after-a-menu experiment was removed after it froze the first line of dialogue.</w:t>
             </w:r>
           </w:p>
         </w:tc>
@@ -1134,7 +1134,7 @@
                 <w:sz w:val="20"/>
                 <w:szCs w:val="20"/>
               </w:rPr>
-              <w:t>Smart A. $0539 = $80, then Talk, Door ($B2A6) and the release wait at $FF86, or Search ($B3F3).</w:t>
+              <w:t>Smart A. $0539 = $80, then Door. Behavior $17 falls through to Talk. Any other door jumps to $FF83, which calls $B2A6 and falls into the release wait at $FF86. A Talk miss jumps to Search at $B3F3.</w:t>
             </w:r>
           </w:p>
         </w:tc>
@@ -1260,31 +1260,31 @@
                 <w:sz w:val="20"/>
                 <w:szCs w:val="20"/>
               </w:rPr>
-              <w:t xml:space="preserve">Bank $11 $88CA, $BFB1</w:t>
-            </w:r>
-          </w:p>
-        </w:tc>
-        <w:tc>
-          <w:tcPr>
-            <w:tcW w:w="6560" w:type="dxa"/>
-            <w:shd w:val="clear" w:color="auto" w:fill="FFFFFF"/>
-            <w:tcMar>
-              <w:top w:w="60" w:type="dxa"/>
-              <w:left w:w="80" w:type="dxa"/>
-              <w:bottom w:w="60" w:type="dxa"/>
-              <w:right w:w="80" w:type="dxa"/>
-            </w:tcMar>
-          </w:tcPr>
-          <w:p>
-            <w:pPr>
-              <w:spacing w:before="0" w:after="40"/>
-            </w:pPr>
-            <w:r>
-              <w:rPr>
-                <w:sz w:val="20"/>
-                <w:szCs w:val="20"/>
-              </w:rPr>
-              <w:t xml:space="preserve">If $6178 is $01, set $72F4 bit $10 for the actor in $96, then continue to the AI.</w:t>
+              <w:t>Bank $11 $88CA, $8241</w:t>
+            </w:r>
+          </w:p>
+        </w:tc>
+        <w:tc>
+          <w:tcPr>
+            <w:tcW w:w="6560" w:type="dxa"/>
+            <w:shd w:val="clear" w:color="auto" w:fill="FFFFFF"/>
+            <w:tcMar>
+              <w:top w:w="60" w:type="dxa"/>
+              <w:left w:w="80" w:type="dxa"/>
+              <w:bottom w:w="60" w:type="dxa"/>
+              <w:right w:w="80" w:type="dxa"/>
+            </w:tcMar>
+          </w:tcPr>
+          <w:p>
+            <w:pPr>
+              <w:spacing w:before="0" w:after="40"/>
+            </w:pPr>
+            <w:r>
+              <w:rPr>
+                <w:sz w:val="20"/>
+                <w:szCs w:val="20"/>
+              </w:rPr>
+              <w:t>If $6178 is $01, $BFB1 clears $7358 and skips the fight prompt. Otherwise the hero keeps the stock prompt, and a chapter lead is prompted from party slot 0. $88CA no longer calls $BFB1. It still runs the AI break.</w:t>
             </w:r>
           </w:p>
         </w:tc>
@@ -1409,7 +1409,7 @@
         <w:spacing w:before="0" w:after="140"/>
       </w:pPr>
       <w:r>
-        <w:t>There was no spare bank. The Select handler fits in the bytes that used to spin on Select, from $CA0E through $CA20, and in $CC46 through $CC52. The smart-action bank switch sits in $CC53 through $CC62, which had been four unused NOPs plus the bytes freed when the world-map tail moved. Talk, Door, and Search share $80BA through $80F8. $80F8 is a NOP. $80F9 is the first byte of the original talk hit and was not overwritten. After a door, $FF86 in both fixed banks waits until A is released. Leave $FF8E as JMP $C03D.</w:t>
+        <w:t>There was no spare bank. The Select handler fits in the bytes that used to spin on Select, from $CA0E through $CA20, and in $CC46 through $CC52. The smart-action bank switch sits in $CC53 through $CC62, which had been four unused NOPs plus the bytes freed when the world-map tail moved. Talk, Door, and Search share $80BA through $80F8. $80F8 is the last byte of the shared search. $80F9 is the first byte of the original talk hit and was not overwritten. $FF80 is JMP $C913, a tail call with the same result as the old JSR $C913 / RTS. $FF83 is JSR $B2A6 and returns into the release wait at $FF86. Leave $FF8E as JMP $C03D. The two NOPs inside the $FF74 frame wait were left in place so $12 still counts at the old speed. $FF70 through $FF73 were the only shared $FF bytes in both fixed banks. They are now the Set AI bridge. The toggle and both log lines occupy bank $17 $BEE4 through $BF5D, which had been $FF. Bank $11 $BFB1 through $BFD7 is the fight-prompt gate, and $BFD8 stays the signature.</w:t>
       </w:r>
     </w:p>
     <w:p>
@@ -1465,15 +1465,15 @@
         <w:spacing w:before="0" w:after="60"/>
       </w:pPr>
       <w:r>
-        <w:t xml:space="preserve">Zero-page $13, $10, and $11. $0553 bit 0 was a retired page-clear flag. Do not bring it back. $6178 is the tactics opt-in and is not a scratch flag.</w:t>
-      </w:r>
-    </w:p>
-    <w:p>
-      <w:pPr>
-        <w:spacing w:before="0" w:after="140"/>
-      </w:pPr>
-      <w:r>
-        <w:t xml:space="preserve">Bank $16 $83F0 through $83F9 are NOPs left by the page-clear edit. Nothing should jump there. The old file-select crash was a jump into that spot when it was not a safe entry.</w:t>
+        <w:t>Zero-page $13, $10, and $11. $0553 bit 0 was a retired page-clear flag. Do not bring it back. $6178 is the player-AI flag. $01 means tactics guide the controlled character. Any other value means manual commands. It is not a scratch flag.</w:t>
+      </w:r>
+    </w:p>
+    <w:p>
+      <w:pPr>
+        <w:spacing w:before="0" w:after="140"/>
+      </w:pPr>
+      <w:r>
+        <w:t>Bank $16 $8028 jumps to $83F0 on purpose. $83F0 through $83F9 skip the text seek when $51 is $17. A jump into the middle of that hook is still unsafe. The old file-select crash was a jump into that spot when it was not a safe entry.</w:t>
       </w:r>
     </w:p>
     <w:p>
@@ -1518,7 +1518,7 @@
         <w:spacing w:before="0" w:after="60"/>
       </w:pPr>
       <w:r>
-        <w:t>The Tactics line shows up from early in the game. Each round the choice is Fight, Run, or Tactics, and the round then follows the tactic that was picked.</w:t>
+        <w:t>The Tactics line shows up from early in the game. Each round the choice is Fight, Run, or Tactics. Fight plays the round from the tactic already picked. Set AI was confirmed in play: On lets tactics guide the controlled character, and Off gives that character the normal command menu. The other party members keep using tactics either way.</w:t>
       </w:r>
     </w:p>
     <w:p>
@@ -1542,7 +1542,7 @@
         <w:spacing w:before="0" w:after="60"/>
       </w:pPr>
       <w:r>
-        <w:t>Smart A tries Talk, then Door, then Search. If Door runs, that press waits until A is released and does not continue into Search. This has not been tried in play yet. The world-map move to bank $16 $BFB6 has not been proven in play either.</w:t>
+        <w:t>Smart A tries Door, then Talk, then Search. Behavior $17, a shop counter, is not treated as a door on this path. If Door runs, that press waits until A is released and does not continue into Search. This has not been tried in play yet. The world-map move to bank $16 $BFB6 has not been proven in play either.</w:t>
       </w:r>
     </w:p>
     <w:p>
@@ -1575,19 +1575,19 @@
         <w:spacing w:before="0" w:after="60"/>
       </w:pPr>
       <w:r>
-        <w:t>A talks to the wrong person: the near tile is scanned before the far tile. $80E6 is that order.</w:t>
-      </w:r>
-    </w:p>
-    <w:p>
-      <w:pPr>
-        <w:numPr>
-          <w:ilvl w:val="0"/>
-          <w:numId w:val="1"/>
-        </w:numPr>
-        <w:spacing w:before="0" w:after="60"/>
-      </w:pPr>
-      <w:r>
-        <w:t>A door never opens, or an empty counter opens Door: Door is the $B35D test, behaviors $14 through $23, one tile ahead. Narrow that test if a counter in that range should Search instead. If a door opens and Search also runs, the release wait at $FF86 did not run. Smart A should call $B2A6 and then jump to $FF86.</w:t>
+        <w:t>A talks to the wrong person: the near tile is scanned before the far tile. $80E7 is that order.</w:t>
+      </w:r>
+    </w:p>
+    <w:p>
+      <w:pPr>
+        <w:numPr>
+          <w:ilvl w:val="0"/>
+          <w:numId w:val="1"/>
+        </w:numPr>
+        <w:spacing w:before="0" w:after="60"/>
+      </w:pPr>
+      <w:r>
+        <w:t>A door never opens, or a shop counter opens as a door: smart A uses $B35D, behaviors $14 through $23, one tile ahead, and then skips behavior $17. Menu Door does not skip $17. If a door opens and Search also runs, $FF83 did not fall into $FF86.</w:t>
       </w:r>
     </w:p>
     <w:p>
@@ -1611,7 +1611,7 @@
         <w:spacing w:before="0" w:after="60"/>
       </w:pPr>
       <w:r>
-        <w:t xml:space="preserve">The first line of dialogue freezes: a page-clear call is running before the window size is set. $8028, $8A6F, and $8AA1 should still be the original bytes.</w:t>
+        <w:t>The first line of dialogue freezes: a page-clear call is running before the window size is set. $8A6F and $8AA1 should still be LDA $F8 / RTS, and $8028 should be JSR $83F0. A $51 value left at $17 also makes the next message skip its seek.</w:t>
       </w:r>
     </w:p>
     <w:sectPr>

</xml_diff>

<commit_message>
Publish Smart Context v1.3.0 with the dialogue font.
</commit_message>
<xml_diff>
--- a/dragon-warrior-iv-rom-hack-notes.docx
+++ b/dragon-warrior-iv-rom-hack-notes.docx
@@ -13,7 +13,7 @@
     <w:p>
       <w:pPr/>
       <w:r>
-        <w:t xml:space="preserve">October 27, 2026. Notes for the screen-reader hack of the USA NES release. This file matches Smart Context v1.2.0.</w:t>
+        <w:t xml:space="preserve">October 28, 2026. Notes for the screen-reader hack of the USA NES release. This file matches Smart Context v1.3.0.</w:t>
       </w:r>
     </w:p>
     <w:p>
@@ -25,7 +25,7 @@
     <w:p>
       <w:pPr/>
       <w:r>
-        <w:t xml:space="preserve">Every change is in that ROM. There is no Lua script and no Game Genie code. The original ROM file was not modified. 652 bytes differ from the original. The patched ROM CRC32 is 6DB88122. The BPS is 774 bytes. Its target CRC32 is 6DB88122. It includes page clear, Door then Talk then Search, the Select menu, Hunt, and Set AI. The ROM is still 524,304 bytes, and the iNES header is unchanged.</w:t>
+        <w:t xml:space="preserve">Every change is in that ROM. There is no Lua script and no Game Genie code. The original ROM file was not modified. 693 bytes differ from the original. The patched ROM CRC32 is CE12F61E. The BPS is 854 bytes. Its target CRC32 is CE12F61E. It includes page clear, Door then Talk then Search, the Select menu, Hunt, Set AI, and the dialogue font. The ROM is still 524,304 bytes, and the iNES header is unchanged.</w:t>
       </w:r>
     </w:p>
     <w:p>
@@ -106,6 +106,12 @@
       </w:r>
     </w:p>
     <w:p>
+      <w:pPr/>
+      <w:r>
+        <w:t xml:space="preserve">Nine dialogue letters were redrawn so they are easier to tell apart. Zero is a box with a short upright stroke, so it does not match the round letter O. Lowercase i and lowercase l use the capital pictures, so the gap on their right is one pixel. A word such as will is drawn as wILL. The stored text is still the same letters. The ink color is the color the game already uses. The menu alphabet, the window frame, and the continue mark are the original shapes. The letters load when the game starts, so reset the ROM to see them.</w:t>
+      </w:r>
+    </w:p>
+    <w:p>
       <w:pPr>
         <w:pStyle w:val="Heading2"/>
       </w:pPr>
@@ -116,13 +122,13 @@
     <w:p>
       <w:pPr/>
       <w:r>
-        <w:t xml:space="preserve">Leave Dragon Warrior IV (USA).nes as it shipped. Apply the BPS to a copy and save that copy under a new name. The unmodified USA ROM is 524,304 bytes and its CRC32 is F6B24806. The patched ROM CRC32 is 6DB88122. The BPS file is 774 bytes. Its CRC32 is A0D50ED8, which is the checksum of every byte except the final four. Those four bytes store the same value. Use Floating IPS.</w:t>
-      </w:r>
-    </w:p>
-    <w:p>
-      <w:pPr/>
-      <w:r>
-        <w:t xml:space="preserve">Release v1.1.0 is the previous patch. Its target CRC32 is 7AA6D320. It does not include Hunt, and it still has the world-map sentence bug. Release v1.0.0 is older still, and Floating IPS rejects that file. Its target CRC32 was D22F542B.</w:t>
+        <w:t xml:space="preserve">Leave Dragon Warrior IV (USA).nes as it shipped. Apply the BPS to a copy and save that copy under a new name. The unmodified USA ROM is 524,304 bytes and its CRC32 is F6B24806. The patched ROM CRC32 is CE12F61E. The BPS file is 854 bytes. Its CRC32 is 8A42DF20, which is the checksum of every byte except the final four. Those four bytes store the same value. Use Floating IPS.</w:t>
+      </w:r>
+    </w:p>
+    <w:p>
+      <w:pPr/>
+      <w:r>
+        <w:t xml:space="preserve">Release v1.2.0 is the previous patch. Its target CRC32 is 6DB88122. It does not include the dialogue font. Release v1.1.0 is older. Its target CRC32 is 7AA6D320. It does not include Hunt, and it still has the world-map sentence bug. Release v1.0.0 is older still, and Floating IPS rejects that file. Its target CRC32 was D22F542B.</w:t>
       </w:r>
     </w:p>
     <w:p>
@@ -160,7 +166,7 @@
     <w:p>
       <w:pPr/>
       <w:r>
-        <w:t xml:space="preserve">Bank $16, mapped at $8000, holds the text engine and the moved world-map routine. Bank $1E holds the command menu, Talk, Door, and Search. Bank $11 holds the battle AI hook. Bank $17 holds Set AI and Hunt. Bank $18 holds the encounter roll. Those banks do not share addresses. Bank $16 $BFB6 and bank $11 $BFB1 are different bytes.</w:t>
+        <w:t xml:space="preserve">Bank $16, mapped at $8000, holds the text engine and the moved world-map routine. Bank $1E holds the command menu, Talk, Door, and Search. Bank $11 holds the battle AI hook. Bank $17 holds Set AI and Hunt. Bank $18 holds the encounter roll and the dialogue font. Those banks do not share addresses. Bank $16 $BFB6 and bank $11 $BFB1 are different bytes.</w:t>
       </w:r>
     </w:p>
     <w:p>
@@ -293,6 +299,92 @@
       <w:pPr/>
       <w:r>
         <w:t xml:space="preserve">The field menu line that used to say Search now says Set AI. Smart A still searches, so the menu does not need its own Search command. Set AI opens the existing yes/no menu, script $48. Yes stores $01 in SRAM $6178 and the log says Player AI On. No stores $00 and the log says Player AI Off. Cancel changes nothing. A new game, and any value other than $01, stays on manual commands, the same fight prompt as stock Dragon Quest IV. Set the flag on the field before a battle. It stays for that fight. The battle Tactics menu still changes the plan and does not write $6178. The other party members keep using tactics either way. When $6178 is $01, $BFB1 skips the fight prompt and the existing battle AI takes the turn. When it is not $01, the hero keeps the stock prompt, and a chapter lead is prompted from party slot 0. $8219 is the original compare again. Set AI was confirmed in play. On leaves the controlled character to the tactic. Off gives that character the normal command menu. The two log lines are Huffman text in bank $17. Bank $16 $8028 calls $83F0 first, and that hook skips the normal text seek only when $51 is $17, after pulling the saved sentence number. $51 is cleared after the line. The old Search jump at bank $1E $8340 is now JMP $FF70. The Door jump at $8343 is now JMP $CC46, the Hunt bridge. The menu label at bank $16 $B061 is HUNT, bytes 2C 39 32 38. SET AI at $B05B is unchanged. Both fixed banks hold BRK index $03, argument $78, then RTS, which enters bank $17 at $BEE4. Smart A still jumps to the old Search body at $B3F3. Each round the player still chooses Fight, Run, or Tactics. Fight plays the round from the tactic already picked. Tactics changes that plan.</w:t>
+      </w:r>
+    </w:p>
+    <w:p>
+      <w:pPr>
+        <w:pStyle w:val="Heading2"/>
+      </w:pPr>
+      <w:r>
+        <w:t xml:space="preserve">Dialogue font</w:t>
+      </w:r>
+    </w:p>
+    <w:p>
+      <w:pPr/>
+      <w:r>
+        <w:t xml:space="preserve">The dialogue font is one bit per pixel, 8 bytes per glyph, in bank $18 at $B83D through $BC9D. That block is 140 glyphs, indexes $00 through $8B, at file offset 0x6384D. Digits are $00 through $09. Lowercase a through z are $0A through $23. Uppercase A through Z are $24 through $3D. The period is $77. The heavier menu font starts at $BC9D and was left as it shipped. The loader at $B798 was left as it shipped. It still writes eight zero bytes into the second bit plane, so each letter is still one color of ink. Day and night, and the other palette changes, recolor that ink. Do not change the font color.</w:t>
+      </w:r>
+    </w:p>
+    <w:p>
+      <w:pPr/>
+      <w:r>
+        <w:t xml:space="preserve">The plotter in bank $16 copies exactly 8 bytes and then advances a fixed 8 pixels. There is no width table. The rightmost column is the one-pixel gap before the next letter.</w:t>
+      </w:r>
+    </w:p>
+    <w:p>
+      <w:pPr/>
+      <w:r>
+        <w:t xml:space="preserve">Nine glyphs differ from the original. Those nine account for 41 bytes. The other 1,079 bytes of this font are the original bytes.</w:t>
+      </w:r>
+    </w:p>
+    <w:p>
+      <w:pPr/>
+      <w:r>
+        <w:t xml:space="preserve">$00, zero, used to be nearly the same oval as the letter O. A diagonal slash was drawn first. In a line of text it read as a 9, so that slash was dropped. The glyph in the ROM is a square box with a one-pixel upright stroke in the middle. A one-pixel gap sits on each side of that stroke. The letter O stays round. The number 8 is unchanged.</w:t>
+      </w:r>
+    </w:p>
+    <w:p>
+      <w:pPr/>
+      <w:r>
+        <w:t xml:space="preserve">$01, one, has a small flag at the upper left and a wide foot. The stem is narrower, so the flag and the foot stick out.</w:t>
+      </w:r>
+    </w:p>
+    <w:p>
+      <w:pPr/>
+      <w:r>
+        <w:t xml:space="preserve">$0F, lowercase f, still has the hook at the top. The crossbar no longer runs the full width of the letter. Lowercase t still has a full-width bar.</w:t>
+      </w:r>
+    </w:p>
+    <w:p>
+      <w:pPr/>
+      <w:r>
+        <w:t xml:space="preserve">$12, lowercase i, uses the bitmap of capital I at $2C. Capital I was not edited. The text byte stored in a message is still lowercase i. Capital I has a bar across the top and a bar across the bottom, so the cell is full and the next letter sits one pixel away.</w:t>
+      </w:r>
+    </w:p>
+    <w:p>
+      <w:pPr/>
+      <w:r>
+        <w:t xml:space="preserve">$13, lowercase j, is a little narrower. The hook at the bottom is still there, and there is still a blank row under the dot.</w:t>
+      </w:r>
+    </w:p>
+    <w:p>
+      <w:pPr/>
+      <w:r>
+        <w:t xml:space="preserve">$15, lowercase l, uses the bitmap of capital L at $2F. Capital L was not edited. The text byte stored in a message is still lowercase l. A word such as will is drawn as wILL. The foot of L runs to the right edge of the cell, and that foot is what meets the next letter. The upright stroke itself still has open space beside it. That space is inside the letter.</w:t>
+      </w:r>
+    </w:p>
+    <w:p>
+      <w:pPr/>
+      <w:r>
+        <w:t xml:space="preserve">$16, lowercase m, used to fill the top row, so the two gaps were hidden. The top row is now open. The gaps go through the top. Each gap is one pixel.</w:t>
+      </w:r>
+    </w:p>
+    <w:p>
+      <w:pPr/>
+      <w:r>
+        <w:t xml:space="preserve">$20, lowercase w, used to fill the bottom row. The bottom now pinches into points, so the letter is not an m.</w:t>
+      </w:r>
+    </w:p>
+    <w:p>
+      <w:pPr/>
+      <w:r>
+        <w:t xml:space="preserve">$77, the period, used to be one pixel wide. It is now a 2 by 2 block on the same baseline. The comma at $76 was left as it shipped.</w:t>
+      </w:r>
+    </w:p>
+    <w:p>
+      <w:pPr/>
+      <w:r>
+        <w:t xml:space="preserve">The window frame and the down-triangle continue mark at $7F are the original bytes. The letters load when the game starts. A ROM that is already running keeps the old shapes until it is reset on this file.</w:t>
       </w:r>
     </w:p>
     <w:p>
@@ -1157,6 +1249,42 @@
           </w:p>
         </w:tc>
       </w:tr>
+      <w:tr>
+        <w:tc>
+          <w:tcPr>
+            <w:tcW w:w="3200" w:type="dxa"/>
+            <w:tcMar>
+              <w:top w:w="80" w:type="dxa"/>
+              <w:left w:w="120" w:type="dxa"/>
+              <w:bottom w:w="80" w:type="dxa"/>
+              <w:right w:w="120" w:type="dxa"/>
+            </w:tcMar>
+          </w:tcPr>
+          <w:p>
+            <w:r>
+              <w:rPr/>
+              <w:t xml:space="preserve">Bank $18 $B83D</w:t>
+            </w:r>
+          </w:p>
+        </w:tc>
+        <w:tc>
+          <w:tcPr>
+            <w:tcW w:w="6160" w:type="dxa"/>
+            <w:tcMar>
+              <w:top w:w="80" w:type="dxa"/>
+              <w:left w:w="120" w:type="dxa"/>
+              <w:bottom w:w="80" w:type="dxa"/>
+              <w:right w:w="120" w:type="dxa"/>
+            </w:tcMar>
+          </w:tcPr>
+          <w:p>
+            <w:r>
+              <w:rPr/>
+              <w:t xml:space="preserve">Dialogue font. Nine glyphs, 41 bytes: $00, $01, $0F, $12, $13, $15, $16, $20, and $77. Lowercase i and l use the capital I and L bitmaps. The loader at $B798 and the menu font at $BC9D are unchanged.</w:t>
+            </w:r>
+          </w:p>
+        </w:tc>
+      </w:tr>
     </w:tbl>
     <w:p>
       <w:pPr>
@@ -1169,7 +1297,7 @@
     <w:p>
       <w:pPr/>
       <w:r>
-        <w:t xml:space="preserve">There was no spare bank. The Select handler fits in the bytes that used to spin on Select, from $CA0E through $CA20. $CC46 through $CC52 is the Hunt bridge. The menu preamble that used to live at $CC68 now lives at bank $17 $BF5E, and $CC68 is the bank-switch opener plus the Select release wait. The smart-action bank switch sits in $CC53 through $CC62, which had been four unused NOPs plus the bytes freed when the world-map tail moved. Talk, Door, and Search share $80BA through $80F8. $80F8 is the last byte of the shared search. $80F9 is the first byte of the original talk hit and was not overwritten. $FF80 is JMP $C913, a tail call with the same result as the old JSR $C913 / RTS. $FF83 is JSR $B2A6 and returns into the release wait at $FF86. Leave $FF8E as JMP $C03D. The two NOPs inside the $FF74 frame wait were left in place so $12 still counts at the old speed. $FF70 through $FF73 were the only shared $FF bytes in both fixed banks. They are now the Set AI bridge. The Set AI toggle and both of its log lines occupy bank $17 $BEE4 through $BF5D. The old menu preamble now starts at $BF5E. The Hunt routine, its pointer table, and the Hunt On and Hunt Off lines occupy $BF77 through $BFC5. $BFC6 through $BFD7 is still $FF, and $BFD8 stays the signature. Bank $11 $BFB1 through $BFD7 is the fight-prompt gate, and $BFD8 stays the signature. Bank $18 $BFC8 is the Hunt encounter check.</w:t>
+        <w:t xml:space="preserve">There was no spare bank. The Select handler fits in the bytes that used to spin on Select, from $CA0E through $CA20. $CC46 through $CC52 is the Hunt bridge. The menu preamble that used to live at $CC68 now lives at bank $17 $BF5E, and $CC68 is the bank-switch opener plus the Select release wait. The smart-action bank switch sits in $CC53 through $CC62, which had been four unused NOPs plus the bytes freed when the world-map tail moved. Talk, Door, and Search share $80BA through $80F8. $80F8 is the last byte of the shared search. $80F9 is the first byte of the original talk hit and was not overwritten. $FF80 is JMP $C913, a tail call with the same result as the old JSR $C913 / RTS. $FF83 is JSR $B2A6 and returns into the release wait at $FF86. Leave $FF8E as JMP $C03D. The two NOPs inside the $FF74 frame wait were left in place so $12 still counts at the old speed. $FF70 through $FF73 were the only shared $FF bytes in both fixed banks. They are now the Set AI bridge. The Set AI toggle and both of its log lines occupy bank $17 $BEE4 through $BF5D. The old menu preamble now starts at $BF5E. The Hunt routine, its pointer table, and the Hunt On and Hunt Off lines occupy $BF77 through $BFC5. $BFC6 through $BFD7 is still $FF, and $BFD8 stays the signature. Bank $11 $BFB1 through $BFD7 is the fight-prompt gate, and $BFD8 stays the signature. Bank $18 $BFC8 is the Hunt encounter check. The dialogue font edit stays inside the existing cells at bank $18 $B83D. No new routine was added for the font.</w:t>
       </w:r>
     </w:p>
     <w:p>
@@ -1360,6 +1488,17 @@
       </w:pPr>
       <w:r>
         <w:t xml:space="preserve">Hunt Off still rolls random fights: $62D6 should be $01, and bank $18 $9BED should call $BFC8. Do not use bit 7 of $6288 as the Hunt flag.</w:t>
+      </w:r>
+    </w:p>
+    <w:p>
+      <w:pPr>
+        <w:numPr>
+          <w:ilvl w:val="0"/>
+          <w:numId w:val="1"/>
+        </w:numPr>
+      </w:pPr>
+      <w:r>
+        <w:t xml:space="preserve">The letters still look like the original: reset on the patched ROM. The loader at bank $18 $B798 runs when the game starts. $B83D should hold the nine new glyphs. The menu font at $BC9D stays the original heavier alphabet.</w:t>
       </w:r>
     </w:p>
     <w:sectPr>

</xml_diff>

<commit_message>
Publish Smart Context v1.4.0 with doubled battle rewards and the original dialogue font.
</commit_message>
<xml_diff>
--- a/dragon-warrior-iv-rom-hack-notes.docx
+++ b/dragon-warrior-iv-rom-hack-notes.docx
@@ -13,19 +13,19 @@
     <w:p>
       <w:pPr/>
       <w:r>
-        <w:t xml:space="preserve">October 28, 2026. Notes for the screen-reader hack of the USA NES release. This file matches Smart Context v1.3.0.</w:t>
-      </w:r>
-    </w:p>
-    <w:p>
-      <w:pPr/>
-      <w:r>
-        <w:t xml:space="preserve">The working copy used to write this hack is named Dragon Warrior IV (USA) - page clear.nes. Other people get the same changes from the BPS patch dragon-warrior-iv-usa-smart-context.bps. Apply it to an unmodified USA ROM and save a new file. This document does not include the game.</w:t>
-      </w:r>
-    </w:p>
-    <w:p>
-      <w:pPr/>
-      <w:r>
-        <w:t xml:space="preserve">Every change is in that ROM. There is no Lua script and no Game Genie code. The original ROM file was not modified. 693 bytes differ from the original. The patched ROM CRC32 is CE12F61E. The BPS is 854 bytes. Its target CRC32 is CE12F61E. It includes page clear, Door then Talk then Search, the Select menu, Hunt, Set AI, and the dialogue font. The ROM is still 524,304 bytes, and the iNES header is unchanged.</w:t>
+        <w:t>October 28, 2026. Notes for the screen-reader hack of the USA NES release. This file matches Smart Context v1.4.0. Battle experience and gold from a win are doubled, and the dialogue font is the original.</w:t>
+      </w:r>
+    </w:p>
+    <w:p>
+      <w:pPr/>
+      <w:r>
+        <w:t>The working copy used to write this hack is named Dragon Warrior IV (USA) - page clear.nes. Other people get the same changes from the BPS patch dragon-warrior-iv-usa-smart-context.bps. Apply it to an unmodified USA ROM and save a new file. This document does not include the game.</w:t>
+      </w:r>
+    </w:p>
+    <w:p>
+      <w:pPr/>
+      <w:r>
+        <w:t>Every change is in that ROM. There is no Lua script and no Game Genie code. The original ROM file was not modified. 654 bytes differ from the original. The patched ROM CRC32 is 01AA83F2. The dialogue font is the original. The published BPS is 853 bytes and its target CRC32 is 01AA83F2. It includes page clear, Door then Talk then Search, the Select menu, Hunt, Set AI, battle tactics, and doubled battle experience and gold. The ROM is still 524,304 bytes, and the iNES header is unchanged.</w:t>
       </w:r>
     </w:p>
     <w:p>
@@ -108,7 +108,13 @@
     <w:p>
       <w:pPr/>
       <w:r>
-        <w:t xml:space="preserve">Nine dialogue letters were redrawn so they are easier to tell apart. Zero is a box with a short upright stroke, so it does not match the round letter O. Lowercase i and lowercase l use the capital pictures, so the gap on their right is one pixel. A word such as will is drawn as wILL. The stored text is still the same letters. The ink color is the color the game already uses. The menu alphabet, the window frame, and the continue mark are the original shapes. The letters load when the game starts, so reset the ROM to see them.</w:t>
+        <w:t>The dialogue letters are the original shapes again. The readable trial and the Final Fantasy review were taken out. The menu alphabet, the window frame, and the continue mark were already the original shapes. The letters load when the game starts, so reset the ROM to see them.</w:t>
+      </w:r>
+    </w:p>
+    <w:p>
+      <w:pPr/>
+      <w:r>
+        <w:t xml:space="preserve">Winning a battle pays twice the experience and twice the gold. The same characters receive it as before, including people riding in the wagon when the wagon is along. A Star card already used this doubling for one battle, so that card still pays double. Shop sales, the casino, Taloon’s story payments, and the king’s 3,000 experience gift to Ragnar stay at the original amounts.</w:t>
       </w:r>
     </w:p>
     <w:p>
@@ -122,13 +128,13 @@
     <w:p>
       <w:pPr/>
       <w:r>
-        <w:t xml:space="preserve">Leave Dragon Warrior IV (USA).nes as it shipped. Apply the BPS to a copy and save that copy under a new name. The unmodified USA ROM is 524,304 bytes and its CRC32 is F6B24806. The patched ROM CRC32 is CE12F61E. The BPS file is 854 bytes. Its CRC32 is 8A42DF20, which is the checksum of every byte except the final four. Those four bytes store the same value. Use Floating IPS.</w:t>
-      </w:r>
-    </w:p>
-    <w:p>
-      <w:pPr/>
-      <w:r>
-        <w:t xml:space="preserve">Release v1.2.0 is the previous patch. Its target CRC32 is 6DB88122. It does not include the dialogue font. Release v1.1.0 is older. Its target CRC32 is 7AA6D320. It does not include Hunt, and it still has the world-map sentence bug. Release v1.0.0 is older still, and Floating IPS rejects that file. Its target CRC32 was D22F542B.</w:t>
+        <w:t>Leave Dragon Warrior IV (USA).nes as it shipped. Apply the BPS to a copy and save that copy under a new name. The unmodified USA ROM is 524,304 bytes and its CRC32 is F6B24806. Applying the published BPS produces CRC32 01AA83F2. The BPS file is 853 bytes. Its CRC32 is D90F7C4B, which is the checksum of every byte except the final four. Those four bytes store the same value. Use Floating IPS.</w:t>
+      </w:r>
+    </w:p>
+    <w:p>
+      <w:pPr/>
+      <w:r>
+        <w:t>Release v1.3.0 is the previous patch. Its target CRC32 is CE12F61E. It includes the readable dialogue font and does not include the reward change. Release v1.2.0 is older. Its target CRC32 is 6DB88122. It does not include the dialogue font. Release v1.1.0 is older. Its target CRC32 is 7AA6D320. It does not include Hunt, and it still has the world-map sentence bug. Release v1.0.0 is older still, and Floating IPS rejects that file. Its target CRC32 was D22F542B.</w:t>
       </w:r>
     </w:p>
     <w:p>
@@ -166,7 +172,7 @@
     <w:p>
       <w:pPr/>
       <w:r>
-        <w:t xml:space="preserve">Bank $16, mapped at $8000, holds the text engine and the moved world-map routine. Bank $1E holds the command menu, Talk, Door, and Search. Bank $11 holds the battle AI hook. Bank $17 holds Set AI and Hunt. Bank $18 holds the encounter roll and the dialogue font. Those banks do not share addresses. Bank $16 $BFB6 and bank $11 $BFB1 are different bytes.</w:t>
+        <w:t>Bank $16, mapped at $8000, holds the text engine and the moved world-map routine. Bank $1E holds the command menu, Talk, Door, and Search. Bank $11 holds the battle AI hook. Bank $17 holds Set AI and Hunt. Bank $18 holds the encounter roll and the dialogue font. Bank $12 holds the battle experience and gold totals. Those banks do not share addresses. Bank $16 $BFB6 and bank $11 $BFB1 are different bytes.</w:t>
       </w:r>
     </w:p>
     <w:p>
@@ -324,13 +330,13 @@
     <w:p>
       <w:pPr/>
       <w:r>
-        <w:t xml:space="preserve">Nine glyphs differ from the original. Those nine account for 41 bytes. The other 1,079 bytes of this font are the original bytes.</w:t>
-      </w:r>
-    </w:p>
-    <w:p>
-      <w:pPr/>
-      <w:r>
-        <w:t xml:space="preserve">$00, zero, used to be nearly the same oval as the letter O. A diagonal slash was drawn first. In a line of text it read as a 9, so that slash was dropped. The glyph in the ROM is a square box with a one-pixel upright stroke in the middle. A one-pixel gap sits on each side of that stroke. The letter O stays round. The number 8 is unchanged.</w:t>
+        <w:t>The dialogue font in this ROM is the original 1,120 bytes. The readable trial and the Final Fantasy review are not in the file. The readable trial, ten glyphs and 48 bytes, remains in dragon-warrior-iv-sprites/font/readable-trial-1bpp.bin.</w:t>
+      </w:r>
+    </w:p>
+    <w:p>
+      <w:pPr/>
+      <w:r>
+        <w:t>$00, zero, used to be nearly the same oval as the letter O. A diagonal slash was drawn first. In a line of text it read as a 9, so that slash was dropped. These glyph notes are the readable trial in readable-trial-1bpp.bin, and are not in this ROM. This ROM has the original letters. In that trial the glyph is a square box with a one-pixel upright stroke in the middle. A one-pixel gap sits on each side of that stroke. The letter O stays round. The number 8 is unchanged.</w:t>
       </w:r>
     </w:p>
     <w:p>
@@ -379,6 +385,12 @@
       <w:pPr/>
       <w:r>
         <w:t xml:space="preserve">$77, the period, used to be one pixel wide. It is now a 2 by 2 block on the same baseline. The comma at $76 was left as it shipped.</w:t>
+      </w:r>
+    </w:p>
+    <w:p>
+      <w:pPr/>
+      <w:r>
+        <w:t>$10, lowercase g, in that saved trial is a copy of capital G at $2A. The bytes are 7C C6 C6 C0 DE C6 7E 00. The two-bowl shape was tried and the screen reader still missed it. The digit 9 at $09 was left unchanged in that trial. The ROM now has the original g at $10, bytes 00 3C 66 66 3E 06 3C 00.</w:t>
       </w:r>
     </w:p>
     <w:p>
@@ -1280,7 +1292,79 @@
           <w:p>
             <w:r>
               <w:rPr/>
-              <w:t xml:space="preserve">Dialogue font. Nine glyphs, 41 bytes: $00, $01, $0F, $12, $13, $15, $16, $20, and $77. Lowercase i and l use the capital I and L bitmaps. The loader at $B798 and the menu font at $BC9D are unchanged.</w:t>
+              <w:t>Dialogue font. Original shapes, all 1,120 bytes. The loader at $B798 and the menu font at $BC9D are unchanged.</w:t>
+            </w:r>
+          </w:p>
+        </w:tc>
+      </w:tr>
+      <w:tr>
+        <w:tc>
+          <w:tcPr>
+            <w:tcW w:w="3200" w:type="dxa"/>
+            <w:tcMar>
+              <w:top w:w="80" w:type="dxa"/>
+              <w:left w:w="120" w:type="dxa"/>
+              <w:bottom w:w="80" w:type="dxa"/>
+              <w:right w:w="120" w:type="dxa"/>
+            </w:tcMar>
+          </w:tcPr>
+          <w:p>
+            <w:r>
+              <w:rPr/>
+              <w:t xml:space="preserve">Bank $12 $87EE</w:t>
+            </w:r>
+          </w:p>
+        </w:tc>
+        <w:tc>
+          <w:tcPr>
+            <w:tcW w:w="6160" w:type="dxa"/>
+            <w:tcMar>
+              <w:top w:w="80" w:type="dxa"/>
+              <w:left w:w="120" w:type="dxa"/>
+              <w:bottom w:w="80" w:type="dxa"/>
+              <w:right w:w="120" w:type="dxa"/>
+            </w:tcMar>
+          </w:tcPr>
+          <w:p>
+            <w:r>
+              <w:rPr/>
+              <w:t xml:space="preserve">Experience double. The BCC displacement is $00, so ASL $7203, ROL $7204, ROL $7205 always runs. It used to skip that shift unless bit 0 of $72E5 was set.</w:t>
+            </w:r>
+          </w:p>
+        </w:tc>
+      </w:tr>
+      <w:tr>
+        <w:tc>
+          <w:tcPr>
+            <w:tcW w:w="3200" w:type="dxa"/>
+            <w:tcMar>
+              <w:top w:w="80" w:type="dxa"/>
+              <w:left w:w="120" w:type="dxa"/>
+              <w:bottom w:w="80" w:type="dxa"/>
+              <w:right w:w="120" w:type="dxa"/>
+            </w:tcMar>
+          </w:tcPr>
+          <w:p>
+            <w:r>
+              <w:rPr/>
+              <w:t xml:space="preserve">Bank $12 $885B</w:t>
+            </w:r>
+          </w:p>
+        </w:tc>
+        <w:tc>
+          <w:tcPr>
+            <w:tcW w:w="6160" w:type="dxa"/>
+            <w:tcMar>
+              <w:top w:w="80" w:type="dxa"/>
+              <w:left w:w="120" w:type="dxa"/>
+              <w:bottom w:w="80" w:type="dxa"/>
+              <w:right w:w="120" w:type="dxa"/>
+            </w:tcMar>
+          </w:tcPr>
+          <w:p>
+            <w:r>
+              <w:rPr/>
+              <w:t xml:space="preserve">Gold double. The BCC displacement is $00, so ASL $7201, ROL $7202 always runs. It used to skip that shift unless the same bit was set. File offsets are 0x487FF and 0x4886C.</w:t>
             </w:r>
           </w:p>
         </w:tc>
@@ -1297,7 +1381,7 @@
     <w:p>
       <w:pPr/>
       <w:r>
-        <w:t xml:space="preserve">There was no spare bank. The Select handler fits in the bytes that used to spin on Select, from $CA0E through $CA20. $CC46 through $CC52 is the Hunt bridge. The menu preamble that used to live at $CC68 now lives at bank $17 $BF5E, and $CC68 is the bank-switch opener plus the Select release wait. The smart-action bank switch sits in $CC53 through $CC62, which had been four unused NOPs plus the bytes freed when the world-map tail moved. Talk, Door, and Search share $80BA through $80F8. $80F8 is the last byte of the shared search. $80F9 is the first byte of the original talk hit and was not overwritten. $FF80 is JMP $C913, a tail call with the same result as the old JSR $C913 / RTS. $FF83 is JSR $B2A6 and returns into the release wait at $FF86. Leave $FF8E as JMP $C03D. The two NOPs inside the $FF74 frame wait were left in place so $12 still counts at the old speed. $FF70 through $FF73 were the only shared $FF bytes in both fixed banks. They are now the Set AI bridge. The Set AI toggle and both of its log lines occupy bank $17 $BEE4 through $BF5D. The old menu preamble now starts at $BF5E. The Hunt routine, its pointer table, and the Hunt On and Hunt Off lines occupy $BF77 through $BFC5. $BFC6 through $BFD7 is still $FF, and $BFD8 stays the signature. Bank $11 $BFB1 through $BFD7 is the fight-prompt gate, and $BFD8 stays the signature. Bank $18 $BFC8 is the Hunt encounter check. The dialogue font edit stays inside the existing cells at bank $18 $B83D. No new routine was added for the font.</w:t>
+        <w:t>There was no spare bank. The Select handler fits in the bytes that used to spin on Select, from $CA0E through $CA20. $CC46 through $CC52 is the Hunt bridge. The menu preamble that used to live at $CC68 now lives at bank $17 $BF5E, and $CC68 is the bank-switch opener plus the Select release wait. The smart-action bank switch sits in $CC53 through $CC62, which had been four unused NOPs plus the bytes freed when the world-map tail moved. Talk, Door, and Search share $80BA through $80F8. $80F8 is the last byte of the shared search. $80F9 is the first byte of the original talk hit and was not overwritten. $FF80 is JMP $C913, a tail call with the same result as the old JSR $C913 / RTS. $FF83 is JSR $B2A6 and returns into the release wait at $FF86. Leave $FF8E as JMP $C03D. The two NOPs inside the $FF74 frame wait were left in place so $12 still counts at the old speed. $FF70 through $FF73 were the only shared $FF bytes in both fixed banks. They are now the Set AI bridge. The Set AI toggle and both of its log lines occupy bank $17 $BEE4 through $BF5D. The old menu preamble now starts at $BF5E. The Hunt routine, its pointer table, and the Hunt On and Hunt Off lines occupy $BF77 through $BFC5. $BFC6 through $BFD7 is still $FF, and $BFD8 stays the signature. Bank $11 $BFB1 through $BFD7 is the fight-prompt gate, and $BFD8 stays the signature. Bank $18 $BFC8 is the Hunt encounter check. The dialogue font at bank $18 $B83D is the original 1,120 bytes. No new routine was added for the font. The reward change is two branch displacements in bank $12, at $87EE and $885B. No new routine was added for that either.</w:t>
       </w:r>
     </w:p>
     <w:p>
@@ -1406,6 +1490,12 @@
       </w:r>
     </w:p>
     <w:p>
+      <w:pPr/>
+      <w:r>
+        <w:t xml:space="preserve">The double battle reward is in this ROM. It has not been checked in a fight yet.</w:t>
+      </w:r>
+    </w:p>
+    <w:p>
       <w:pPr>
         <w:pStyle w:val="Heading2"/>
       </w:pPr>
@@ -1498,7 +1588,18 @@
         </w:numPr>
       </w:pPr>
       <w:r>
-        <w:t xml:space="preserve">The letters still look like the original: reset on the patched ROM. The loader at bank $18 $B798 runs when the game starts. $B83D should hold the nine new glyphs. The menu font at $BC9D stays the original heavier alphabet.</w:t>
+        <w:t>The letters still look like a trial: reset on the patched ROM. The loader at bank $18 $B798 runs when the game starts. $B83D holds the original dialogue font. Lowercase g at $10 is 00 3C 66 66 3E 06 3C 00. The menu font at $BC9D stays the original heavier alphabet.</w:t>
+      </w:r>
+    </w:p>
+    <w:p>
+      <w:pPr>
+        <w:numPr>
+          <w:ilvl w:val="0"/>
+          <w:numId w:val="1"/>
+        </w:numPr>
+      </w:pPr>
+      <w:r>
+        <w:t xml:space="preserve">A battle pays the old experience or gold: bank $12 $87EE should be BCC with displacement $00, and $885B should be BCC with displacement $00. Those used to be $09 and $06. The shifts they guard are ASL $7203, ROL $7204, ROL $7205 for experience, and ASL $7201, ROL $7202 for gold.</w:t>
       </w:r>
     </w:p>
     <w:sectPr>

</xml_diff>